<commit_message>
Strengthen ATL evaluation submission
</commit_message>
<xml_diff>
--- a/docs/Aarav_Nagar_ANN_MPS_FinRL_Technical_Report.docx
+++ b/docs/Aarav_Nagar_ANN_MPS_FinRL_Technical_Report.docx
@@ -2152,7 +2152,653 @@
           <w:color w:val="000000"/>
           <w:sz w:val="21"/>
         </w:rPr>
-        <w:t>The PPO values are means across three seeds. MPS produced a lower Sharpe than ANN in every paired run: 0.759 compared with 0.790 for seed 0, 0.726 compared with 0.812 for seed 1, and 0.596 compared with 0.602 for seed 2. MPS traded less and had a slightly smaller mean drawdown, but it also produced lower return and risk-adjusted performance.</w:t>
+        <w:t>The PPO values are means across seeds 0, 1, and 2.</w:t>
+      </w:r>
+    </w:p>
+    <w:p>
+      <w:pPr>
+        <w:pStyle w:val="Caption"/>
+      </w:pPr>
+      <w:r>
+        <w:rPr>
+          <w:rFonts w:ascii="Times New Roman" w:hAnsi="Times New Roman"/>
+          <w:b w:val="0"/>
+          <w:i/>
+          <w:color w:val="000000"/>
+          <w:sz w:val="19"/>
+        </w:rPr>
+        <w:t>Table 4. Paired PPO Sharpe ratios by random seed</w:t>
+      </w:r>
+    </w:p>
+    <w:tbl>
+      <w:tblPr>
+        <w:tblStyle w:val="TableGrid"/>
+        <w:tblW w:type="dxa" w:w="9360"/>
+        <w:jc w:val="left"/>
+        <w:tblLayout w:type="fixed"/>
+        <w:tblLook w:firstColumn="1" w:firstRow="1" w:lastColumn="0" w:lastRow="0" w:noHBand="0" w:noVBand="1" w:val="04A0"/>
+        <w:tblInd w:w="100" w:type="dxa"/>
+      </w:tblPr>
+      <w:tblGrid>
+        <w:gridCol w:w="1500"/>
+        <w:gridCol w:w="2100"/>
+        <w:gridCol w:w="2100"/>
+        <w:gridCol w:w="3660"/>
+      </w:tblGrid>
+      <w:tr>
+        <w:trPr>
+          <w:tblHeader w:val="true"/>
+        </w:trPr>
+        <w:tc>
+          <w:tcPr>
+            <w:tcW w:type="dxa" w:w="1500"/>
+            <w:shd w:fill="E7E6E6"/>
+            <w:tcMar>
+              <w:top w:w="80" w:type="dxa"/>
+              <w:bottom w:w="80" w:type="dxa"/>
+              <w:start w:w="100" w:type="dxa"/>
+              <w:end w:w="100" w:type="dxa"/>
+            </w:tcMar>
+            <w:vAlign w:val="center"/>
+          </w:tcPr>
+          <w:p>
+            <w:pPr>
+              <w:spacing w:after="0"/>
+              <w:jc w:val="center"/>
+            </w:pPr>
+            <w:r/>
+            <w:r>
+              <w:rPr>
+                <w:rFonts w:ascii="Times New Roman" w:hAnsi="Times New Roman"/>
+                <w:b/>
+                <w:i w:val="0"/>
+                <w:color w:val="000000"/>
+                <w:sz w:val="17"/>
+              </w:rPr>
+              <w:t>Seed</w:t>
+            </w:r>
+          </w:p>
+        </w:tc>
+        <w:tc>
+          <w:tcPr>
+            <w:tcW w:type="dxa" w:w="2100"/>
+            <w:shd w:fill="E7E6E6"/>
+            <w:tcMar>
+              <w:top w:w="80" w:type="dxa"/>
+              <w:bottom w:w="80" w:type="dxa"/>
+              <w:start w:w="100" w:type="dxa"/>
+              <w:end w:w="100" w:type="dxa"/>
+            </w:tcMar>
+            <w:vAlign w:val="center"/>
+          </w:tcPr>
+          <w:p>
+            <w:pPr>
+              <w:spacing w:after="0"/>
+              <w:jc w:val="center"/>
+            </w:pPr>
+            <w:r/>
+            <w:r>
+              <w:rPr>
+                <w:rFonts w:ascii="Times New Roman" w:hAnsi="Times New Roman"/>
+                <w:b/>
+                <w:i w:val="0"/>
+                <w:color w:val="000000"/>
+                <w:sz w:val="17"/>
+              </w:rPr>
+              <w:t>ANN signal</w:t>
+            </w:r>
+          </w:p>
+        </w:tc>
+        <w:tc>
+          <w:tcPr>
+            <w:tcW w:type="dxa" w:w="2100"/>
+            <w:shd w:fill="E7E6E6"/>
+            <w:tcMar>
+              <w:top w:w="80" w:type="dxa"/>
+              <w:bottom w:w="80" w:type="dxa"/>
+              <w:start w:w="100" w:type="dxa"/>
+              <w:end w:w="100" w:type="dxa"/>
+            </w:tcMar>
+            <w:vAlign w:val="center"/>
+          </w:tcPr>
+          <w:p>
+            <w:pPr>
+              <w:spacing w:after="0"/>
+              <w:jc w:val="center"/>
+            </w:pPr>
+            <w:r/>
+            <w:r>
+              <w:rPr>
+                <w:rFonts w:ascii="Times New Roman" w:hAnsi="Times New Roman"/>
+                <w:b/>
+                <w:i w:val="0"/>
+                <w:color w:val="000000"/>
+                <w:sz w:val="17"/>
+              </w:rPr>
+              <w:t>MPS signal</w:t>
+            </w:r>
+          </w:p>
+        </w:tc>
+        <w:tc>
+          <w:tcPr>
+            <w:tcW w:type="dxa" w:w="3660"/>
+            <w:shd w:fill="E7E6E6"/>
+            <w:tcMar>
+              <w:top w:w="80" w:type="dxa"/>
+              <w:bottom w:w="80" w:type="dxa"/>
+              <w:start w:w="100" w:type="dxa"/>
+              <w:end w:w="100" w:type="dxa"/>
+            </w:tcMar>
+            <w:vAlign w:val="center"/>
+          </w:tcPr>
+          <w:p>
+            <w:pPr>
+              <w:spacing w:after="0"/>
+              <w:jc w:val="center"/>
+            </w:pPr>
+            <w:r/>
+            <w:r>
+              <w:rPr>
+                <w:rFonts w:ascii="Times New Roman" w:hAnsi="Times New Roman"/>
+                <w:b/>
+                <w:i w:val="0"/>
+                <w:color w:val="000000"/>
+                <w:sz w:val="17"/>
+              </w:rPr>
+              <w:t>MPS minus ANN</w:t>
+            </w:r>
+          </w:p>
+        </w:tc>
+      </w:tr>
+      <w:tr>
+        <w:tc>
+          <w:tcPr>
+            <w:tcW w:type="dxa" w:w="1500"/>
+            <w:tcMar>
+              <w:top w:w="80" w:type="dxa"/>
+              <w:bottom w:w="80" w:type="dxa"/>
+              <w:start w:w="100" w:type="dxa"/>
+              <w:end w:w="100" w:type="dxa"/>
+            </w:tcMar>
+            <w:vAlign w:val="center"/>
+          </w:tcPr>
+          <w:p>
+            <w:pPr>
+              <w:spacing w:after="0"/>
+              <w:jc w:val="center"/>
+            </w:pPr>
+            <w:r/>
+            <w:r>
+              <w:rPr>
+                <w:rFonts w:ascii="Times New Roman" w:hAnsi="Times New Roman"/>
+                <w:b w:val="0"/>
+                <w:i w:val="0"/>
+                <w:color w:val="000000"/>
+                <w:sz w:val="17"/>
+              </w:rPr>
+              <w:t>0</w:t>
+            </w:r>
+          </w:p>
+        </w:tc>
+        <w:tc>
+          <w:tcPr>
+            <w:tcW w:type="dxa" w:w="2100"/>
+            <w:tcMar>
+              <w:top w:w="80" w:type="dxa"/>
+              <w:bottom w:w="80" w:type="dxa"/>
+              <w:start w:w="100" w:type="dxa"/>
+              <w:end w:w="100" w:type="dxa"/>
+            </w:tcMar>
+            <w:vAlign w:val="center"/>
+          </w:tcPr>
+          <w:p>
+            <w:pPr>
+              <w:spacing w:after="0"/>
+              <w:jc w:val="center"/>
+            </w:pPr>
+            <w:r/>
+            <w:r>
+              <w:rPr>
+                <w:rFonts w:ascii="Times New Roman" w:hAnsi="Times New Roman"/>
+                <w:b w:val="0"/>
+                <w:i w:val="0"/>
+                <w:color w:val="000000"/>
+                <w:sz w:val="17"/>
+              </w:rPr>
+              <w:t>0.790</w:t>
+            </w:r>
+          </w:p>
+        </w:tc>
+        <w:tc>
+          <w:tcPr>
+            <w:tcW w:type="dxa" w:w="2100"/>
+            <w:tcMar>
+              <w:top w:w="80" w:type="dxa"/>
+              <w:bottom w:w="80" w:type="dxa"/>
+              <w:start w:w="100" w:type="dxa"/>
+              <w:end w:w="100" w:type="dxa"/>
+            </w:tcMar>
+            <w:vAlign w:val="center"/>
+          </w:tcPr>
+          <w:p>
+            <w:pPr>
+              <w:spacing w:after="0"/>
+              <w:jc w:val="center"/>
+            </w:pPr>
+            <w:r/>
+            <w:r>
+              <w:rPr>
+                <w:rFonts w:ascii="Times New Roman" w:hAnsi="Times New Roman"/>
+                <w:b w:val="0"/>
+                <w:i w:val="0"/>
+                <w:color w:val="000000"/>
+                <w:sz w:val="17"/>
+              </w:rPr>
+              <w:t>0.759</w:t>
+            </w:r>
+          </w:p>
+        </w:tc>
+        <w:tc>
+          <w:tcPr>
+            <w:tcW w:type="dxa" w:w="3660"/>
+            <w:tcMar>
+              <w:top w:w="80" w:type="dxa"/>
+              <w:bottom w:w="80" w:type="dxa"/>
+              <w:start w:w="100" w:type="dxa"/>
+              <w:end w:w="100" w:type="dxa"/>
+            </w:tcMar>
+            <w:vAlign w:val="center"/>
+          </w:tcPr>
+          <w:p>
+            <w:pPr>
+              <w:spacing w:after="0"/>
+              <w:jc w:val="center"/>
+            </w:pPr>
+            <w:r/>
+            <w:r>
+              <w:rPr>
+                <w:rFonts w:ascii="Times New Roman" w:hAnsi="Times New Roman"/>
+                <w:b w:val="0"/>
+                <w:i w:val="0"/>
+                <w:color w:val="000000"/>
+                <w:sz w:val="17"/>
+              </w:rPr>
+              <w:t>-0.032</w:t>
+            </w:r>
+          </w:p>
+        </w:tc>
+      </w:tr>
+      <w:tr>
+        <w:tc>
+          <w:tcPr>
+            <w:tcW w:type="dxa" w:w="1500"/>
+            <w:tcMar>
+              <w:top w:w="80" w:type="dxa"/>
+              <w:bottom w:w="80" w:type="dxa"/>
+              <w:start w:w="100" w:type="dxa"/>
+              <w:end w:w="100" w:type="dxa"/>
+            </w:tcMar>
+            <w:vAlign w:val="center"/>
+          </w:tcPr>
+          <w:p>
+            <w:pPr>
+              <w:spacing w:after="0"/>
+              <w:jc w:val="center"/>
+            </w:pPr>
+            <w:r/>
+            <w:r>
+              <w:rPr>
+                <w:rFonts w:ascii="Times New Roman" w:hAnsi="Times New Roman"/>
+                <w:b w:val="0"/>
+                <w:i w:val="0"/>
+                <w:color w:val="000000"/>
+                <w:sz w:val="17"/>
+              </w:rPr>
+              <w:t>1</w:t>
+            </w:r>
+          </w:p>
+        </w:tc>
+        <w:tc>
+          <w:tcPr>
+            <w:tcW w:type="dxa" w:w="2100"/>
+            <w:tcMar>
+              <w:top w:w="80" w:type="dxa"/>
+              <w:bottom w:w="80" w:type="dxa"/>
+              <w:start w:w="100" w:type="dxa"/>
+              <w:end w:w="100" w:type="dxa"/>
+            </w:tcMar>
+            <w:vAlign w:val="center"/>
+          </w:tcPr>
+          <w:p>
+            <w:pPr>
+              <w:spacing w:after="0"/>
+              <w:jc w:val="center"/>
+            </w:pPr>
+            <w:r/>
+            <w:r>
+              <w:rPr>
+                <w:rFonts w:ascii="Times New Roman" w:hAnsi="Times New Roman"/>
+                <w:b w:val="0"/>
+                <w:i w:val="0"/>
+                <w:color w:val="000000"/>
+                <w:sz w:val="17"/>
+              </w:rPr>
+              <w:t>0.812</w:t>
+            </w:r>
+          </w:p>
+        </w:tc>
+        <w:tc>
+          <w:tcPr>
+            <w:tcW w:type="dxa" w:w="2100"/>
+            <w:tcMar>
+              <w:top w:w="80" w:type="dxa"/>
+              <w:bottom w:w="80" w:type="dxa"/>
+              <w:start w:w="100" w:type="dxa"/>
+              <w:end w:w="100" w:type="dxa"/>
+            </w:tcMar>
+            <w:vAlign w:val="center"/>
+          </w:tcPr>
+          <w:p>
+            <w:pPr>
+              <w:spacing w:after="0"/>
+              <w:jc w:val="center"/>
+            </w:pPr>
+            <w:r/>
+            <w:r>
+              <w:rPr>
+                <w:rFonts w:ascii="Times New Roman" w:hAnsi="Times New Roman"/>
+                <w:b w:val="0"/>
+                <w:i w:val="0"/>
+                <w:color w:val="000000"/>
+                <w:sz w:val="17"/>
+              </w:rPr>
+              <w:t>0.726</w:t>
+            </w:r>
+          </w:p>
+        </w:tc>
+        <w:tc>
+          <w:tcPr>
+            <w:tcW w:type="dxa" w:w="3660"/>
+            <w:tcMar>
+              <w:top w:w="80" w:type="dxa"/>
+              <w:bottom w:w="80" w:type="dxa"/>
+              <w:start w:w="100" w:type="dxa"/>
+              <w:end w:w="100" w:type="dxa"/>
+            </w:tcMar>
+            <w:vAlign w:val="center"/>
+          </w:tcPr>
+          <w:p>
+            <w:pPr>
+              <w:spacing w:after="0"/>
+              <w:jc w:val="center"/>
+            </w:pPr>
+            <w:r/>
+            <w:r>
+              <w:rPr>
+                <w:rFonts w:ascii="Times New Roman" w:hAnsi="Times New Roman"/>
+                <w:b w:val="0"/>
+                <w:i w:val="0"/>
+                <w:color w:val="000000"/>
+                <w:sz w:val="17"/>
+              </w:rPr>
+              <w:t>-0.086</w:t>
+            </w:r>
+          </w:p>
+        </w:tc>
+      </w:tr>
+      <w:tr>
+        <w:tc>
+          <w:tcPr>
+            <w:tcW w:type="dxa" w:w="1500"/>
+            <w:tcMar>
+              <w:top w:w="80" w:type="dxa"/>
+              <w:bottom w:w="80" w:type="dxa"/>
+              <w:start w:w="100" w:type="dxa"/>
+              <w:end w:w="100" w:type="dxa"/>
+            </w:tcMar>
+            <w:vAlign w:val="center"/>
+          </w:tcPr>
+          <w:p>
+            <w:pPr>
+              <w:spacing w:after="0"/>
+              <w:jc w:val="center"/>
+            </w:pPr>
+            <w:r/>
+            <w:r>
+              <w:rPr>
+                <w:rFonts w:ascii="Times New Roman" w:hAnsi="Times New Roman"/>
+                <w:b w:val="0"/>
+                <w:i w:val="0"/>
+                <w:color w:val="000000"/>
+                <w:sz w:val="17"/>
+              </w:rPr>
+              <w:t>2</w:t>
+            </w:r>
+          </w:p>
+        </w:tc>
+        <w:tc>
+          <w:tcPr>
+            <w:tcW w:type="dxa" w:w="2100"/>
+            <w:tcMar>
+              <w:top w:w="80" w:type="dxa"/>
+              <w:bottom w:w="80" w:type="dxa"/>
+              <w:start w:w="100" w:type="dxa"/>
+              <w:end w:w="100" w:type="dxa"/>
+            </w:tcMar>
+            <w:vAlign w:val="center"/>
+          </w:tcPr>
+          <w:p>
+            <w:pPr>
+              <w:spacing w:after="0"/>
+              <w:jc w:val="center"/>
+            </w:pPr>
+            <w:r/>
+            <w:r>
+              <w:rPr>
+                <w:rFonts w:ascii="Times New Roman" w:hAnsi="Times New Roman"/>
+                <w:b w:val="0"/>
+                <w:i w:val="0"/>
+                <w:color w:val="000000"/>
+                <w:sz w:val="17"/>
+              </w:rPr>
+              <w:t>0.602</w:t>
+            </w:r>
+          </w:p>
+        </w:tc>
+        <w:tc>
+          <w:tcPr>
+            <w:tcW w:type="dxa" w:w="2100"/>
+            <w:tcMar>
+              <w:top w:w="80" w:type="dxa"/>
+              <w:bottom w:w="80" w:type="dxa"/>
+              <w:start w:w="100" w:type="dxa"/>
+              <w:end w:w="100" w:type="dxa"/>
+            </w:tcMar>
+            <w:vAlign w:val="center"/>
+          </w:tcPr>
+          <w:p>
+            <w:pPr>
+              <w:spacing w:after="0"/>
+              <w:jc w:val="center"/>
+            </w:pPr>
+            <w:r/>
+            <w:r>
+              <w:rPr>
+                <w:rFonts w:ascii="Times New Roman" w:hAnsi="Times New Roman"/>
+                <w:b w:val="0"/>
+                <w:i w:val="0"/>
+                <w:color w:val="000000"/>
+                <w:sz w:val="17"/>
+              </w:rPr>
+              <w:t>0.596</w:t>
+            </w:r>
+          </w:p>
+        </w:tc>
+        <w:tc>
+          <w:tcPr>
+            <w:tcW w:type="dxa" w:w="3660"/>
+            <w:tcMar>
+              <w:top w:w="80" w:type="dxa"/>
+              <w:bottom w:w="80" w:type="dxa"/>
+              <w:start w:w="100" w:type="dxa"/>
+              <w:end w:w="100" w:type="dxa"/>
+            </w:tcMar>
+            <w:vAlign w:val="center"/>
+          </w:tcPr>
+          <w:p>
+            <w:pPr>
+              <w:spacing w:after="0"/>
+              <w:jc w:val="center"/>
+            </w:pPr>
+            <w:r/>
+            <w:r>
+              <w:rPr>
+                <w:rFonts w:ascii="Times New Roman" w:hAnsi="Times New Roman"/>
+                <w:b w:val="0"/>
+                <w:i w:val="0"/>
+                <w:color w:val="000000"/>
+                <w:sz w:val="17"/>
+              </w:rPr>
+              <w:t>-0.006</w:t>
+            </w:r>
+          </w:p>
+        </w:tc>
+      </w:tr>
+      <w:tr>
+        <w:tc>
+          <w:tcPr>
+            <w:tcW w:type="dxa" w:w="1500"/>
+            <w:tcMar>
+              <w:top w:w="80" w:type="dxa"/>
+              <w:bottom w:w="80" w:type="dxa"/>
+              <w:start w:w="100" w:type="dxa"/>
+              <w:end w:w="100" w:type="dxa"/>
+            </w:tcMar>
+            <w:vAlign w:val="center"/>
+          </w:tcPr>
+          <w:p>
+            <w:pPr>
+              <w:spacing w:after="0"/>
+              <w:jc w:val="center"/>
+            </w:pPr>
+            <w:r/>
+            <w:r>
+              <w:rPr>
+                <w:rFonts w:ascii="Times New Roman" w:hAnsi="Times New Roman"/>
+                <w:b w:val="0"/>
+                <w:i w:val="0"/>
+                <w:color w:val="000000"/>
+                <w:sz w:val="17"/>
+              </w:rPr>
+              <w:t>Mean</w:t>
+            </w:r>
+          </w:p>
+        </w:tc>
+        <w:tc>
+          <w:tcPr>
+            <w:tcW w:type="dxa" w:w="2100"/>
+            <w:tcMar>
+              <w:top w:w="80" w:type="dxa"/>
+              <w:bottom w:w="80" w:type="dxa"/>
+              <w:start w:w="100" w:type="dxa"/>
+              <w:end w:w="100" w:type="dxa"/>
+            </w:tcMar>
+            <w:vAlign w:val="center"/>
+          </w:tcPr>
+          <w:p>
+            <w:pPr>
+              <w:spacing w:after="0"/>
+              <w:jc w:val="center"/>
+            </w:pPr>
+            <w:r/>
+            <w:r>
+              <w:rPr>
+                <w:rFonts w:ascii="Times New Roman" w:hAnsi="Times New Roman"/>
+                <w:b w:val="0"/>
+                <w:i w:val="0"/>
+                <w:color w:val="000000"/>
+                <w:sz w:val="17"/>
+              </w:rPr>
+              <w:t>0.735</w:t>
+            </w:r>
+          </w:p>
+        </w:tc>
+        <w:tc>
+          <w:tcPr>
+            <w:tcW w:type="dxa" w:w="2100"/>
+            <w:tcMar>
+              <w:top w:w="80" w:type="dxa"/>
+              <w:bottom w:w="80" w:type="dxa"/>
+              <w:start w:w="100" w:type="dxa"/>
+              <w:end w:w="100" w:type="dxa"/>
+            </w:tcMar>
+            <w:vAlign w:val="center"/>
+          </w:tcPr>
+          <w:p>
+            <w:pPr>
+              <w:spacing w:after="0"/>
+              <w:jc w:val="center"/>
+            </w:pPr>
+            <w:r/>
+            <w:r>
+              <w:rPr>
+                <w:rFonts w:ascii="Times New Roman" w:hAnsi="Times New Roman"/>
+                <w:b w:val="0"/>
+                <w:i w:val="0"/>
+                <w:color w:val="000000"/>
+                <w:sz w:val="17"/>
+              </w:rPr>
+              <w:t>0.694</w:t>
+            </w:r>
+          </w:p>
+        </w:tc>
+        <w:tc>
+          <w:tcPr>
+            <w:tcW w:type="dxa" w:w="3660"/>
+            <w:tcMar>
+              <w:top w:w="80" w:type="dxa"/>
+              <w:bottom w:w="80" w:type="dxa"/>
+              <w:start w:w="100" w:type="dxa"/>
+              <w:end w:w="100" w:type="dxa"/>
+            </w:tcMar>
+            <w:vAlign w:val="center"/>
+          </w:tcPr>
+          <w:p>
+            <w:pPr>
+              <w:spacing w:after="0"/>
+              <w:jc w:val="center"/>
+            </w:pPr>
+            <w:r/>
+            <w:r>
+              <w:rPr>
+                <w:rFonts w:ascii="Times New Roman" w:hAnsi="Times New Roman"/>
+                <w:b w:val="0"/>
+                <w:i w:val="0"/>
+                <w:color w:val="000000"/>
+                <w:sz w:val="17"/>
+              </w:rPr>
+              <w:t>-0.041</w:t>
+            </w:r>
+          </w:p>
+        </w:tc>
+      </w:tr>
+    </w:tbl>
+    <w:p>
+      <w:pPr>
+        <w:spacing w:after="0" w:line="120" w:lineRule="auto"/>
+      </w:pPr>
+    </w:p>
+    <w:p>
+      <w:pPr/>
+      <w:r>
+        <w:rPr>
+          <w:rFonts w:ascii="Times New Roman" w:hAnsi="Times New Roman"/>
+          <w:b w:val="0"/>
+          <w:i w:val="0"/>
+          <w:color w:val="000000"/>
+          <w:sz w:val="21"/>
+        </w:rPr>
+        <w:t>ANN produced a higher Sharpe in all three paired runs. Because only three seeds were tested, this is descriptive evidence rather than a high-powered significance result. MPS traded less and had a slightly smaller mean drawdown, but it also produced lower return and risk-adjusted performance.</w:t>
       </w:r>
     </w:p>
     <w:p>
@@ -2229,8 +2875,759 @@
           <w:color w:val="000000"/>
           <w:sz w:val="21"/>
         </w:rPr>
-        <w:t>Daily returns were averaged across seeds and evaluated with a moving 20-trading-day block bootstrap using 2,000 samples. The annualized return difference, MPS minus ANN, was -0.92 percentage points. The 95% interval was -4.63 to +2.63 percentage points, and the bootstrap probability that MPS exceeded ANN was 31.05%. Because the interval includes zero, the experiment does not establish a reliable difference between the two signal agents.</w:t>
+        <w:t>Daily returns were averaged across seeds and evaluated with a moving 20-trading-day block bootstrap using 2,000 samples. The annualized return difference, MPS minus ANN, was -0.92 percentage points. The 95% interval was -4.63 to +2.63 percentage points, and the bootstrap probability that MPS exceeded ANN was 31.05%. Because the interval includes zero, the experiment does not establish a reliable difference between the two signal agents. This interval describes time-series uncertainty conditional on the three trained seed-mean policies; it does not replace inference across a larger set of independently trained PPO seeds.</w:t>
       </w:r>
+    </w:p>
+    <w:p>
+      <w:pPr>
+        <w:pStyle w:val="Caption"/>
+      </w:pPr>
+      <w:r>
+        <w:rPr>
+          <w:rFonts w:ascii="Times New Roman" w:hAnsi="Times New Roman"/>
+          <w:b w:val="0"/>
+          <w:i/>
+          <w:color w:val="000000"/>
+          <w:sz w:val="19"/>
+        </w:rPr>
+        <w:t>Table 5. Mean calendar-year returns across PPO seeds</w:t>
+      </w:r>
+    </w:p>
+    <w:tbl>
+      <w:tblPr>
+        <w:tblStyle w:val="TableGrid"/>
+        <w:tblW w:type="dxa" w:w="9360"/>
+        <w:jc w:val="left"/>
+        <w:tblLayout w:type="fixed"/>
+        <w:tblLook w:firstColumn="1" w:firstRow="1" w:lastColumn="0" w:lastRow="0" w:noHBand="0" w:noVBand="1" w:val="04A0"/>
+        <w:tblInd w:w="100" w:type="dxa"/>
+      </w:tblPr>
+      <w:tblGrid>
+        <w:gridCol w:w="1500"/>
+        <w:gridCol w:w="2100"/>
+        <w:gridCol w:w="2100"/>
+        <w:gridCol w:w="3660"/>
+      </w:tblGrid>
+      <w:tr>
+        <w:trPr>
+          <w:tblHeader w:val="true"/>
+        </w:trPr>
+        <w:tc>
+          <w:tcPr>
+            <w:tcW w:type="dxa" w:w="1500"/>
+            <w:shd w:fill="E7E6E6"/>
+            <w:tcMar>
+              <w:top w:w="80" w:type="dxa"/>
+              <w:bottom w:w="80" w:type="dxa"/>
+              <w:start w:w="100" w:type="dxa"/>
+              <w:end w:w="100" w:type="dxa"/>
+            </w:tcMar>
+            <w:vAlign w:val="center"/>
+          </w:tcPr>
+          <w:p>
+            <w:pPr>
+              <w:spacing w:after="0"/>
+              <w:jc w:val="center"/>
+            </w:pPr>
+            <w:r/>
+            <w:r>
+              <w:rPr>
+                <w:rFonts w:ascii="Times New Roman" w:hAnsi="Times New Roman"/>
+                <w:b/>
+                <w:i w:val="0"/>
+                <w:color w:val="000000"/>
+                <w:sz w:val="17"/>
+              </w:rPr>
+              <w:t>Year</w:t>
+            </w:r>
+          </w:p>
+        </w:tc>
+        <w:tc>
+          <w:tcPr>
+            <w:tcW w:type="dxa" w:w="2100"/>
+            <w:shd w:fill="E7E6E6"/>
+            <w:tcMar>
+              <w:top w:w="80" w:type="dxa"/>
+              <w:bottom w:w="80" w:type="dxa"/>
+              <w:start w:w="100" w:type="dxa"/>
+              <w:end w:w="100" w:type="dxa"/>
+            </w:tcMar>
+            <w:vAlign w:val="center"/>
+          </w:tcPr>
+          <w:p>
+            <w:pPr>
+              <w:spacing w:after="0"/>
+              <w:jc w:val="center"/>
+            </w:pPr>
+            <w:r/>
+            <w:r>
+              <w:rPr>
+                <w:rFonts w:ascii="Times New Roman" w:hAnsi="Times New Roman"/>
+                <w:b/>
+                <w:i w:val="0"/>
+                <w:color w:val="000000"/>
+                <w:sz w:val="17"/>
+              </w:rPr>
+              <w:t>ANN signal</w:t>
+            </w:r>
+          </w:p>
+        </w:tc>
+        <w:tc>
+          <w:tcPr>
+            <w:tcW w:type="dxa" w:w="2100"/>
+            <w:shd w:fill="E7E6E6"/>
+            <w:tcMar>
+              <w:top w:w="80" w:type="dxa"/>
+              <w:bottom w:w="80" w:type="dxa"/>
+              <w:start w:w="100" w:type="dxa"/>
+              <w:end w:w="100" w:type="dxa"/>
+            </w:tcMar>
+            <w:vAlign w:val="center"/>
+          </w:tcPr>
+          <w:p>
+            <w:pPr>
+              <w:spacing w:after="0"/>
+              <w:jc w:val="center"/>
+            </w:pPr>
+            <w:r/>
+            <w:r>
+              <w:rPr>
+                <w:rFonts w:ascii="Times New Roman" w:hAnsi="Times New Roman"/>
+                <w:b/>
+                <w:i w:val="0"/>
+                <w:color w:val="000000"/>
+                <w:sz w:val="17"/>
+              </w:rPr>
+              <w:t>MPS signal</w:t>
+            </w:r>
+          </w:p>
+        </w:tc>
+        <w:tc>
+          <w:tcPr>
+            <w:tcW w:type="dxa" w:w="3660"/>
+            <w:shd w:fill="E7E6E6"/>
+            <w:tcMar>
+              <w:top w:w="80" w:type="dxa"/>
+              <w:bottom w:w="80" w:type="dxa"/>
+              <w:start w:w="100" w:type="dxa"/>
+              <w:end w:w="100" w:type="dxa"/>
+            </w:tcMar>
+            <w:vAlign w:val="center"/>
+          </w:tcPr>
+          <w:p>
+            <w:pPr>
+              <w:spacing w:after="0"/>
+              <w:jc w:val="center"/>
+            </w:pPr>
+            <w:r/>
+            <w:r>
+              <w:rPr>
+                <w:rFonts w:ascii="Times New Roman" w:hAnsi="Times New Roman"/>
+                <w:b/>
+                <w:i w:val="0"/>
+                <w:color w:val="000000"/>
+                <w:sz w:val="17"/>
+              </w:rPr>
+              <w:t>MPS minus ANN</w:t>
+            </w:r>
+          </w:p>
+        </w:tc>
+      </w:tr>
+      <w:tr>
+        <w:tc>
+          <w:tcPr>
+            <w:tcW w:type="dxa" w:w="1500"/>
+            <w:tcMar>
+              <w:top w:w="80" w:type="dxa"/>
+              <w:bottom w:w="80" w:type="dxa"/>
+              <w:start w:w="100" w:type="dxa"/>
+              <w:end w:w="100" w:type="dxa"/>
+            </w:tcMar>
+            <w:vAlign w:val="center"/>
+          </w:tcPr>
+          <w:p>
+            <w:pPr>
+              <w:spacing w:after="0"/>
+              <w:jc w:val="center"/>
+            </w:pPr>
+            <w:r/>
+            <w:r>
+              <w:rPr>
+                <w:rFonts w:ascii="Times New Roman" w:hAnsi="Times New Roman"/>
+                <w:b w:val="0"/>
+                <w:i w:val="0"/>
+                <w:color w:val="000000"/>
+                <w:sz w:val="17"/>
+              </w:rPr>
+              <w:t>2019</w:t>
+            </w:r>
+          </w:p>
+        </w:tc>
+        <w:tc>
+          <w:tcPr>
+            <w:tcW w:type="dxa" w:w="2100"/>
+            <w:tcMar>
+              <w:top w:w="80" w:type="dxa"/>
+              <w:bottom w:w="80" w:type="dxa"/>
+              <w:start w:w="100" w:type="dxa"/>
+              <w:end w:w="100" w:type="dxa"/>
+            </w:tcMar>
+            <w:vAlign w:val="center"/>
+          </w:tcPr>
+          <w:p>
+            <w:pPr>
+              <w:spacing w:after="0"/>
+              <w:jc w:val="center"/>
+            </w:pPr>
+            <w:r/>
+            <w:r>
+              <w:rPr>
+                <w:rFonts w:ascii="Times New Roman" w:hAnsi="Times New Roman"/>
+                <w:b w:val="0"/>
+                <w:i w:val="0"/>
+                <w:color w:val="000000"/>
+                <w:sz w:val="17"/>
+              </w:rPr>
+              <w:t>15.69%</w:t>
+            </w:r>
+          </w:p>
+        </w:tc>
+        <w:tc>
+          <w:tcPr>
+            <w:tcW w:type="dxa" w:w="2100"/>
+            <w:tcMar>
+              <w:top w:w="80" w:type="dxa"/>
+              <w:bottom w:w="80" w:type="dxa"/>
+              <w:start w:w="100" w:type="dxa"/>
+              <w:end w:w="100" w:type="dxa"/>
+            </w:tcMar>
+            <w:vAlign w:val="center"/>
+          </w:tcPr>
+          <w:p>
+            <w:pPr>
+              <w:spacing w:after="0"/>
+              <w:jc w:val="center"/>
+            </w:pPr>
+            <w:r/>
+            <w:r>
+              <w:rPr>
+                <w:rFonts w:ascii="Times New Roman" w:hAnsi="Times New Roman"/>
+                <w:b w:val="0"/>
+                <w:i w:val="0"/>
+                <w:color w:val="000000"/>
+                <w:sz w:val="17"/>
+              </w:rPr>
+              <w:t>14.85%</w:t>
+            </w:r>
+          </w:p>
+        </w:tc>
+        <w:tc>
+          <w:tcPr>
+            <w:tcW w:type="dxa" w:w="3660"/>
+            <w:tcMar>
+              <w:top w:w="80" w:type="dxa"/>
+              <w:bottom w:w="80" w:type="dxa"/>
+              <w:start w:w="100" w:type="dxa"/>
+              <w:end w:w="100" w:type="dxa"/>
+            </w:tcMar>
+            <w:vAlign w:val="center"/>
+          </w:tcPr>
+          <w:p>
+            <w:pPr>
+              <w:spacing w:after="0"/>
+              <w:jc w:val="center"/>
+            </w:pPr>
+            <w:r/>
+            <w:r>
+              <w:rPr>
+                <w:rFonts w:ascii="Times New Roman" w:hAnsi="Times New Roman"/>
+                <w:b w:val="0"/>
+                <w:i w:val="0"/>
+                <w:color w:val="000000"/>
+                <w:sz w:val="17"/>
+              </w:rPr>
+              <w:t>-0.84 pp</w:t>
+            </w:r>
+          </w:p>
+        </w:tc>
+      </w:tr>
+      <w:tr>
+        <w:tc>
+          <w:tcPr>
+            <w:tcW w:type="dxa" w:w="1500"/>
+            <w:tcMar>
+              <w:top w:w="80" w:type="dxa"/>
+              <w:bottom w:w="80" w:type="dxa"/>
+              <w:start w:w="100" w:type="dxa"/>
+              <w:end w:w="100" w:type="dxa"/>
+            </w:tcMar>
+            <w:vAlign w:val="center"/>
+          </w:tcPr>
+          <w:p>
+            <w:pPr>
+              <w:spacing w:after="0"/>
+              <w:jc w:val="center"/>
+            </w:pPr>
+            <w:r/>
+            <w:r>
+              <w:rPr>
+                <w:rFonts w:ascii="Times New Roman" w:hAnsi="Times New Roman"/>
+                <w:b w:val="0"/>
+                <w:i w:val="0"/>
+                <w:color w:val="000000"/>
+                <w:sz w:val="17"/>
+              </w:rPr>
+              <w:t>2020</w:t>
+            </w:r>
+          </w:p>
+        </w:tc>
+        <w:tc>
+          <w:tcPr>
+            <w:tcW w:type="dxa" w:w="2100"/>
+            <w:tcMar>
+              <w:top w:w="80" w:type="dxa"/>
+              <w:bottom w:w="80" w:type="dxa"/>
+              <w:start w:w="100" w:type="dxa"/>
+              <w:end w:w="100" w:type="dxa"/>
+            </w:tcMar>
+            <w:vAlign w:val="center"/>
+          </w:tcPr>
+          <w:p>
+            <w:pPr>
+              <w:spacing w:after="0"/>
+              <w:jc w:val="center"/>
+            </w:pPr>
+            <w:r/>
+            <w:r>
+              <w:rPr>
+                <w:rFonts w:ascii="Times New Roman" w:hAnsi="Times New Roman"/>
+                <w:b w:val="0"/>
+                <w:i w:val="0"/>
+                <w:color w:val="000000"/>
+                <w:sz w:val="17"/>
+              </w:rPr>
+              <w:t>25.85%</w:t>
+            </w:r>
+          </w:p>
+        </w:tc>
+        <w:tc>
+          <w:tcPr>
+            <w:tcW w:type="dxa" w:w="2100"/>
+            <w:tcMar>
+              <w:top w:w="80" w:type="dxa"/>
+              <w:bottom w:w="80" w:type="dxa"/>
+              <w:start w:w="100" w:type="dxa"/>
+              <w:end w:w="100" w:type="dxa"/>
+            </w:tcMar>
+            <w:vAlign w:val="center"/>
+          </w:tcPr>
+          <w:p>
+            <w:pPr>
+              <w:spacing w:after="0"/>
+              <w:jc w:val="center"/>
+            </w:pPr>
+            <w:r/>
+            <w:r>
+              <w:rPr>
+                <w:rFonts w:ascii="Times New Roman" w:hAnsi="Times New Roman"/>
+                <w:b w:val="0"/>
+                <w:i w:val="0"/>
+                <w:color w:val="000000"/>
+                <w:sz w:val="17"/>
+              </w:rPr>
+              <w:t>26.28%</w:t>
+            </w:r>
+          </w:p>
+        </w:tc>
+        <w:tc>
+          <w:tcPr>
+            <w:tcW w:type="dxa" w:w="3660"/>
+            <w:tcMar>
+              <w:top w:w="80" w:type="dxa"/>
+              <w:bottom w:w="80" w:type="dxa"/>
+              <w:start w:w="100" w:type="dxa"/>
+              <w:end w:w="100" w:type="dxa"/>
+            </w:tcMar>
+            <w:vAlign w:val="center"/>
+          </w:tcPr>
+          <w:p>
+            <w:pPr>
+              <w:spacing w:after="0"/>
+              <w:jc w:val="center"/>
+            </w:pPr>
+            <w:r/>
+            <w:r>
+              <w:rPr>
+                <w:rFonts w:ascii="Times New Roman" w:hAnsi="Times New Roman"/>
+                <w:b w:val="0"/>
+                <w:i w:val="0"/>
+                <w:color w:val="000000"/>
+                <w:sz w:val="17"/>
+              </w:rPr>
+              <w:t>+0.43 pp</w:t>
+            </w:r>
+          </w:p>
+        </w:tc>
+      </w:tr>
+      <w:tr>
+        <w:tc>
+          <w:tcPr>
+            <w:tcW w:type="dxa" w:w="1500"/>
+            <w:tcMar>
+              <w:top w:w="80" w:type="dxa"/>
+              <w:bottom w:w="80" w:type="dxa"/>
+              <w:start w:w="100" w:type="dxa"/>
+              <w:end w:w="100" w:type="dxa"/>
+            </w:tcMar>
+            <w:vAlign w:val="center"/>
+          </w:tcPr>
+          <w:p>
+            <w:pPr>
+              <w:spacing w:after="0"/>
+              <w:jc w:val="center"/>
+            </w:pPr>
+            <w:r/>
+            <w:r>
+              <w:rPr>
+                <w:rFonts w:ascii="Times New Roman" w:hAnsi="Times New Roman"/>
+                <w:b w:val="0"/>
+                <w:i w:val="0"/>
+                <w:color w:val="000000"/>
+                <w:sz w:val="17"/>
+              </w:rPr>
+              <w:t>2021</w:t>
+            </w:r>
+          </w:p>
+        </w:tc>
+        <w:tc>
+          <w:tcPr>
+            <w:tcW w:type="dxa" w:w="2100"/>
+            <w:tcMar>
+              <w:top w:w="80" w:type="dxa"/>
+              <w:bottom w:w="80" w:type="dxa"/>
+              <w:start w:w="100" w:type="dxa"/>
+              <w:end w:w="100" w:type="dxa"/>
+            </w:tcMar>
+            <w:vAlign w:val="center"/>
+          </w:tcPr>
+          <w:p>
+            <w:pPr>
+              <w:spacing w:after="0"/>
+              <w:jc w:val="center"/>
+            </w:pPr>
+            <w:r/>
+            <w:r>
+              <w:rPr>
+                <w:rFonts w:ascii="Times New Roman" w:hAnsi="Times New Roman"/>
+                <w:b w:val="0"/>
+                <w:i w:val="0"/>
+                <w:color w:val="000000"/>
+                <w:sz w:val="17"/>
+              </w:rPr>
+              <w:t>20.48%</w:t>
+            </w:r>
+          </w:p>
+        </w:tc>
+        <w:tc>
+          <w:tcPr>
+            <w:tcW w:type="dxa" w:w="2100"/>
+            <w:tcMar>
+              <w:top w:w="80" w:type="dxa"/>
+              <w:bottom w:w="80" w:type="dxa"/>
+              <w:start w:w="100" w:type="dxa"/>
+              <w:end w:w="100" w:type="dxa"/>
+            </w:tcMar>
+            <w:vAlign w:val="center"/>
+          </w:tcPr>
+          <w:p>
+            <w:pPr>
+              <w:spacing w:after="0"/>
+              <w:jc w:val="center"/>
+            </w:pPr>
+            <w:r/>
+            <w:r>
+              <w:rPr>
+                <w:rFonts w:ascii="Times New Roman" w:hAnsi="Times New Roman"/>
+                <w:b w:val="0"/>
+                <w:i w:val="0"/>
+                <w:color w:val="000000"/>
+                <w:sz w:val="17"/>
+              </w:rPr>
+              <w:t>18.70%</w:t>
+            </w:r>
+          </w:p>
+        </w:tc>
+        <w:tc>
+          <w:tcPr>
+            <w:tcW w:type="dxa" w:w="3660"/>
+            <w:tcMar>
+              <w:top w:w="80" w:type="dxa"/>
+              <w:bottom w:w="80" w:type="dxa"/>
+              <w:start w:w="100" w:type="dxa"/>
+              <w:end w:w="100" w:type="dxa"/>
+            </w:tcMar>
+            <w:vAlign w:val="center"/>
+          </w:tcPr>
+          <w:p>
+            <w:pPr>
+              <w:spacing w:after="0"/>
+              <w:jc w:val="center"/>
+            </w:pPr>
+            <w:r/>
+            <w:r>
+              <w:rPr>
+                <w:rFonts w:ascii="Times New Roman" w:hAnsi="Times New Roman"/>
+                <w:b w:val="0"/>
+                <w:i w:val="0"/>
+                <w:color w:val="000000"/>
+                <w:sz w:val="17"/>
+              </w:rPr>
+              <w:t>-1.78 pp</w:t>
+            </w:r>
+          </w:p>
+        </w:tc>
+      </w:tr>
+      <w:tr>
+        <w:tc>
+          <w:tcPr>
+            <w:tcW w:type="dxa" w:w="1500"/>
+            <w:tcMar>
+              <w:top w:w="80" w:type="dxa"/>
+              <w:bottom w:w="80" w:type="dxa"/>
+              <w:start w:w="100" w:type="dxa"/>
+              <w:end w:w="100" w:type="dxa"/>
+            </w:tcMar>
+            <w:vAlign w:val="center"/>
+          </w:tcPr>
+          <w:p>
+            <w:pPr>
+              <w:spacing w:after="0"/>
+              <w:jc w:val="center"/>
+            </w:pPr>
+            <w:r/>
+            <w:r>
+              <w:rPr>
+                <w:rFonts w:ascii="Times New Roman" w:hAnsi="Times New Roman"/>
+                <w:b w:val="0"/>
+                <w:i w:val="0"/>
+                <w:color w:val="000000"/>
+                <w:sz w:val="17"/>
+              </w:rPr>
+              <w:t>2022</w:t>
+            </w:r>
+          </w:p>
+        </w:tc>
+        <w:tc>
+          <w:tcPr>
+            <w:tcW w:type="dxa" w:w="2100"/>
+            <w:tcMar>
+              <w:top w:w="80" w:type="dxa"/>
+              <w:bottom w:w="80" w:type="dxa"/>
+              <w:start w:w="100" w:type="dxa"/>
+              <w:end w:w="100" w:type="dxa"/>
+            </w:tcMar>
+            <w:vAlign w:val="center"/>
+          </w:tcPr>
+          <w:p>
+            <w:pPr>
+              <w:spacing w:after="0"/>
+              <w:jc w:val="center"/>
+            </w:pPr>
+            <w:r/>
+            <w:r>
+              <w:rPr>
+                <w:rFonts w:ascii="Times New Roman" w:hAnsi="Times New Roman"/>
+                <w:b w:val="0"/>
+                <w:i w:val="0"/>
+                <w:color w:val="000000"/>
+                <w:sz w:val="17"/>
+              </w:rPr>
+              <w:t>-9.24%</w:t>
+            </w:r>
+          </w:p>
+        </w:tc>
+        <w:tc>
+          <w:tcPr>
+            <w:tcW w:type="dxa" w:w="2100"/>
+            <w:tcMar>
+              <w:top w:w="80" w:type="dxa"/>
+              <w:bottom w:w="80" w:type="dxa"/>
+              <w:start w:w="100" w:type="dxa"/>
+              <w:end w:w="100" w:type="dxa"/>
+            </w:tcMar>
+            <w:vAlign w:val="center"/>
+          </w:tcPr>
+          <w:p>
+            <w:pPr>
+              <w:spacing w:after="0"/>
+              <w:jc w:val="center"/>
+            </w:pPr>
+            <w:r/>
+            <w:r>
+              <w:rPr>
+                <w:rFonts w:ascii="Times New Roman" w:hAnsi="Times New Roman"/>
+                <w:b w:val="0"/>
+                <w:i w:val="0"/>
+                <w:color w:val="000000"/>
+                <w:sz w:val="17"/>
+              </w:rPr>
+              <w:t>-15.79%</w:t>
+            </w:r>
+          </w:p>
+        </w:tc>
+        <w:tc>
+          <w:tcPr>
+            <w:tcW w:type="dxa" w:w="3660"/>
+            <w:tcMar>
+              <w:top w:w="80" w:type="dxa"/>
+              <w:bottom w:w="80" w:type="dxa"/>
+              <w:start w:w="100" w:type="dxa"/>
+              <w:end w:w="100" w:type="dxa"/>
+            </w:tcMar>
+            <w:vAlign w:val="center"/>
+          </w:tcPr>
+          <w:p>
+            <w:pPr>
+              <w:spacing w:after="0"/>
+              <w:jc w:val="center"/>
+            </w:pPr>
+            <w:r/>
+            <w:r>
+              <w:rPr>
+                <w:rFonts w:ascii="Times New Roman" w:hAnsi="Times New Roman"/>
+                <w:b w:val="0"/>
+                <w:i w:val="0"/>
+                <w:color w:val="000000"/>
+                <w:sz w:val="17"/>
+              </w:rPr>
+              <w:t>-6.55 pp</w:t>
+            </w:r>
+          </w:p>
+        </w:tc>
+      </w:tr>
+      <w:tr>
+        <w:tc>
+          <w:tcPr>
+            <w:tcW w:type="dxa" w:w="1500"/>
+            <w:tcMar>
+              <w:top w:w="80" w:type="dxa"/>
+              <w:bottom w:w="80" w:type="dxa"/>
+              <w:start w:w="100" w:type="dxa"/>
+              <w:end w:w="100" w:type="dxa"/>
+            </w:tcMar>
+            <w:vAlign w:val="center"/>
+          </w:tcPr>
+          <w:p>
+            <w:pPr>
+              <w:spacing w:after="0"/>
+              <w:jc w:val="center"/>
+            </w:pPr>
+            <w:r/>
+            <w:r>
+              <w:rPr>
+                <w:rFonts w:ascii="Times New Roman" w:hAnsi="Times New Roman"/>
+                <w:b w:val="0"/>
+                <w:i w:val="0"/>
+                <w:color w:val="000000"/>
+                <w:sz w:val="17"/>
+              </w:rPr>
+              <w:t>2023</w:t>
+            </w:r>
+          </w:p>
+        </w:tc>
+        <w:tc>
+          <w:tcPr>
+            <w:tcW w:type="dxa" w:w="2100"/>
+            <w:tcMar>
+              <w:top w:w="80" w:type="dxa"/>
+              <w:bottom w:w="80" w:type="dxa"/>
+              <w:start w:w="100" w:type="dxa"/>
+              <w:end w:w="100" w:type="dxa"/>
+            </w:tcMar>
+            <w:vAlign w:val="center"/>
+          </w:tcPr>
+          <w:p>
+            <w:pPr>
+              <w:spacing w:after="0"/>
+              <w:jc w:val="center"/>
+            </w:pPr>
+            <w:r/>
+            <w:r>
+              <w:rPr>
+                <w:rFonts w:ascii="Times New Roman" w:hAnsi="Times New Roman"/>
+                <w:b w:val="0"/>
+                <w:i w:val="0"/>
+                <w:color w:val="000000"/>
+                <w:sz w:val="17"/>
+              </w:rPr>
+              <w:t>30.72%</w:t>
+            </w:r>
+          </w:p>
+        </w:tc>
+        <w:tc>
+          <w:tcPr>
+            <w:tcW w:type="dxa" w:w="2100"/>
+            <w:tcMar>
+              <w:top w:w="80" w:type="dxa"/>
+              <w:bottom w:w="80" w:type="dxa"/>
+              <w:start w:w="100" w:type="dxa"/>
+              <w:end w:w="100" w:type="dxa"/>
+            </w:tcMar>
+            <w:vAlign w:val="center"/>
+          </w:tcPr>
+          <w:p>
+            <w:pPr>
+              <w:spacing w:after="0"/>
+              <w:jc w:val="center"/>
+            </w:pPr>
+            <w:r/>
+            <w:r>
+              <w:rPr>
+                <w:rFonts w:ascii="Times New Roman" w:hAnsi="Times New Roman"/>
+                <w:b w:val="0"/>
+                <w:i w:val="0"/>
+                <w:color w:val="000000"/>
+                <w:sz w:val="17"/>
+              </w:rPr>
+              <w:t>34.55%</w:t>
+            </w:r>
+          </w:p>
+        </w:tc>
+        <w:tc>
+          <w:tcPr>
+            <w:tcW w:type="dxa" w:w="3660"/>
+            <w:tcMar>
+              <w:top w:w="80" w:type="dxa"/>
+              <w:bottom w:w="80" w:type="dxa"/>
+              <w:start w:w="100" w:type="dxa"/>
+              <w:end w:w="100" w:type="dxa"/>
+            </w:tcMar>
+            <w:vAlign w:val="center"/>
+          </w:tcPr>
+          <w:p>
+            <w:pPr>
+              <w:spacing w:after="0"/>
+              <w:jc w:val="center"/>
+            </w:pPr>
+            <w:r/>
+            <w:r>
+              <w:rPr>
+                <w:rFonts w:ascii="Times New Roman" w:hAnsi="Times New Roman"/>
+                <w:b w:val="0"/>
+                <w:i w:val="0"/>
+                <w:color w:val="000000"/>
+                <w:sz w:val="17"/>
+              </w:rPr>
+              <w:t>+3.83 pp</w:t>
+            </w:r>
+          </w:p>
+        </w:tc>
+      </w:tr>
+    </w:tbl>
+    <w:p>
+      <w:pPr>
+        <w:spacing w:after="0" w:line="120" w:lineRule="auto"/>
+      </w:pPr>
     </w:p>
     <w:p>
       <w:pPr/>
@@ -2242,7 +3639,7 @@
           <w:color w:val="000000"/>
           <w:sz w:val="21"/>
         </w:rPr>
-        <w:t>The results also varied across calendar years. MPS outperformed ANN in 2020 and 2023, while ANN outperformed MPS in 2019, 2021, and 2022. Neither signal agent beat the equal-weight benchmark over the full test period.</w:t>
+        <w:t>MPS outperformed ANN in 2020 and 2023, while ANN outperformed MPS in 2019, 2021, and 2022. Neither signal agent beat the equal-weight benchmark over the full test period.</w:t>
       </w:r>
     </w:p>
     <w:p>
@@ -2323,7 +3720,7 @@
           <w:color w:val="000000"/>
           <w:sz w:val="21"/>
         </w:rPr>
-        <w:t>Before testing a tensor-network policy architecture, I would strengthen this baseline with more random seeds, a longer PPO training budget, and rolling or expanding-window retraining. A policy-level comparison would then be easier to interpret.</w:t>
+        <w:t>Before testing a tensor-network policy architecture, I would strengthen this baseline with 10-20 PPO seeds, a sensitivity sweep over MPS bond dimension, a longer PPO training budget, and rolling or expanding-window retraining. These tests would show whether the current result persists across policy initializations, MPS capacity choices, and market periods. A policy-level comparison would then be easier to interpret.</w:t>
       </w:r>
     </w:p>
     <w:p>
@@ -2345,6 +3742,19 @@
           <w:sz w:val="21"/>
         </w:rPr>
         <w:t>The repository contains the experiment pipeline, integrity tests, daily equity curves, per-seed metrics, calendar-year results, bootstrap output, and a run manifest with the dataset checksum, FinRL commit, configuration, and known limitations.</w:t>
+      </w:r>
+    </w:p>
+    <w:p>
+      <w:pPr/>
+      <w:r>
+        <w:rPr>
+          <w:rFonts w:ascii="Times New Roman" w:hAnsi="Times New Roman"/>
+          <w:b w:val="0"/>
+          <w:i w:val="0"/>
+          <w:color w:val="000000"/>
+          <w:sz w:val="21"/>
+        </w:rPr>
+        <w:t>The exact Python package versions are recorded in requirements-lock.txt. The reference pipeline forces PPO execution on CPU and uses one PyTorch thread. Wall-clock duration was not recorded for the saved run and is therefore not reported.</w:t>
       </w:r>
     </w:p>
     <w:p>

</xml_diff>